<commit_message>
Add network screenshots to report
Co-Authored-By: Claude Sonnet 5.5 <noreply@anthropic.com>
Claude-Session: https://claude.ai/code/session_011DSASePq9E2J7c3UPJh5aF
</commit_message>
<xml_diff>
--- a/Отчёт_ускорение_сайта.docx
+++ b/Отчёт_ускорение_сайта.docx
@@ -3366,48 +3366,39 @@
             <w:vAlign w:val="center"/>
           </w:tcPr>
           <w:p>
-            <w:pPr>
-              <w:jc w:val="center"/>
-            </w:pPr>
-            <w:r>
-              <w:rPr>
-                <w:rFonts w:ascii="Times New Roman" w:cs="Times New Roman" w:eastAsia="Times New Roman" w:hAnsi="Times New Roman"/>
-                <w:b/>
-                <w:bCs/>
-                <w:sz w:val="24"/>
-                <w:szCs w:val="24"/>
-                <w:highlight w:val="yellow"/>
-              </w:rPr>
-              <w:t xml:space="preserve">СКРИНШОТ Б7</w:t>
-            </w:r>
-          </w:p>
-          <w:p>
-            <w:pPr>
-              <w:jc w:val="center"/>
-            </w:pPr>
-            <w:r>
-              <w:rPr>
-                <w:rFonts w:ascii="Times New Roman" w:cs="Times New Roman" w:eastAsia="Times New Roman" w:hAnsi="Times New Roman"/>
-                <w:sz w:val="22"/>
-                <w:szCs w:val="22"/>
-              </w:rPr>
-              <w:t xml:space="preserve">DevTools → Network (с отключённым кэшем, после Ctrl+Shift+R): список файлов и итоговая строка внизу</w:t>
-            </w:r>
-          </w:p>
-          <w:p>
-            <w:pPr>
-              <w:jc w:val="center"/>
-            </w:pPr>
-            <w:r>
-              <w:rPr>
-                <w:rFonts w:ascii="Times New Roman" w:cs="Times New Roman" w:eastAsia="Times New Roman" w:hAnsi="Times New Roman"/>
-                <w:i/>
-                <w:iCs/>
-                <w:color w:val="7F7F7F"/>
-                <w:sz w:val="18"/>
-                <w:szCs w:val="18"/>
-              </w:rPr>
-              <w:t xml:space="preserve">Удалите этот текст и вставьте картинку: Вставка → Рисунок</w:t>
+            <w:r>
+              <w:drawing>
+                <wp:inline xmlns:a="http://schemas.openxmlformats.org/drawingml/2006/main" xmlns:pic="http://schemas.openxmlformats.org/drawingml/2006/picture">
+                  <wp:extent cx="5040000" cy="3207273"/>
+                  <wp:docPr id="17" name="Picture 17"/>
+                  <wp:cNvGraphicFramePr>
+                    <a:graphicFrameLocks noChangeAspect="1"/>
+                  </wp:cNvGraphicFramePr>
+                  <a:graphic>
+                    <a:graphicData uri="http://schemas.openxmlformats.org/drawingml/2006/picture">
+                      <pic:pic>
+                        <pic:nvPicPr>
+                          <pic:cNvPr id="0" name="net-before.png"/>
+                          <pic:cNvPicPr/>
+                        </pic:nvPicPr>
+                        <pic:blipFill>
+                          <a:blip r:embed="rId24"/>
+                          <a:stretch>
+                            <a:fillRect/>
+                          </a:stretch>
+                        </pic:blipFill>
+                        <pic:spPr>
+                          <a:xfrm>
+                            <a:off x="0" y="0"/>
+                            <a:ext cx="5040000" cy="3207273"/>
+                          </a:xfrm>
+                          <a:prstGeom prst="rect"/>
+                        </pic:spPr>
+                      </pic:pic>
+                    </a:graphicData>
+                  </a:graphic>
+                </wp:inline>
+              </w:drawing>
             </w:r>
           </w:p>
         </w:tc>
@@ -9897,48 +9888,39 @@
             <w:vAlign w:val="center"/>
           </w:tcPr>
           <w:p>
-            <w:pPr>
-              <w:jc w:val="center"/>
-            </w:pPr>
-            <w:r>
-              <w:rPr>
-                <w:rFonts w:ascii="Times New Roman" w:cs="Times New Roman" w:eastAsia="Times New Roman" w:hAnsi="Times New Roman"/>
-                <w:b/>
-                <w:bCs/>
-                <w:sz w:val="24"/>
-                <w:szCs w:val="24"/>
-                <w:highlight w:val="yellow"/>
-              </w:rPr>
-              <w:t xml:space="preserve">СКРИНШОТ П7</w:t>
-            </w:r>
-          </w:p>
-          <w:p>
-            <w:pPr>
-              <w:jc w:val="center"/>
-            </w:pPr>
-            <w:r>
-              <w:rPr>
-                <w:rFonts w:ascii="Times New Roman" w:cs="Times New Roman" w:eastAsia="Times New Roman" w:hAnsi="Times New Roman"/>
-                <w:sz w:val="22"/>
-                <w:szCs w:val="22"/>
-              </w:rPr>
-              <w:t xml:space="preserve">DevTools → Network: список файлов и итоговая строка внизу</w:t>
-            </w:r>
-          </w:p>
-          <w:p>
-            <w:pPr>
-              <w:jc w:val="center"/>
-            </w:pPr>
-            <w:r>
-              <w:rPr>
-                <w:rFonts w:ascii="Times New Roman" w:cs="Times New Roman" w:eastAsia="Times New Roman" w:hAnsi="Times New Roman"/>
-                <w:i/>
-                <w:iCs/>
-                <w:color w:val="7F7F7F"/>
-                <w:sz w:val="18"/>
-                <w:szCs w:val="18"/>
-              </w:rPr>
-              <w:t xml:space="preserve">Удалите этот текст и вставьте картинку: Вставка → Рисунок</w:t>
+            <w:r>
+              <w:drawing>
+                <wp:inline xmlns:a="http://schemas.openxmlformats.org/drawingml/2006/main" xmlns:pic="http://schemas.openxmlformats.org/drawingml/2006/picture">
+                  <wp:extent cx="5040000" cy="3207273"/>
+                  <wp:docPr id="18" name="Picture 18"/>
+                  <wp:cNvGraphicFramePr>
+                    <a:graphicFrameLocks noChangeAspect="1"/>
+                  </wp:cNvGraphicFramePr>
+                  <a:graphic>
+                    <a:graphicData uri="http://schemas.openxmlformats.org/drawingml/2006/picture">
+                      <pic:pic>
+                        <pic:nvPicPr>
+                          <pic:cNvPr id="0" name="net-after.png"/>
+                          <pic:cNvPicPr/>
+                        </pic:nvPicPr>
+                        <pic:blipFill>
+                          <a:blip r:embed="rId25"/>
+                          <a:stretch>
+                            <a:fillRect/>
+                          </a:stretch>
+                        </pic:blipFill>
+                        <pic:spPr>
+                          <a:xfrm>
+                            <a:off x="0" y="0"/>
+                            <a:ext cx="5040000" cy="3207273"/>
+                          </a:xfrm>
+                          <a:prstGeom prst="rect"/>
+                        </pic:spPr>
+                      </pic:pic>
+                    </a:graphicData>
+                  </a:graphic>
+                </wp:inline>
+              </w:drawing>
             </w:r>
           </w:p>
         </w:tc>

</xml_diff>